<commit_message>
Update : Backend finalisé et testé
</commit_message>
<xml_diff>
--- a/Docs/03_Rapport/Rapport_PAPPRO2_Toledo.docx
+++ b/Docs/03_Rapport/Rapport_PAPPRO2_Toledo.docx
@@ -209,29 +209,7 @@
                                         <w:szCs w:val="28"/>
                                         <w:lang w:val="fr-FR"/>
                                       </w:rPr>
-                                      <w:t xml:space="preserve">02 février 2026 </w:t>
-                                    </w:r>
-                                    <w:r>
-                                      <w:rPr>
-                                        <w:rFonts w:ascii="Century Gothic" w:hAnsi="Century Gothic" w:cs="Times New Roman"/>
-                                        <w:caps/>
-                                        <w:color w:val="4472C4" w:themeColor="accent1"/>
-                                        <w:sz w:val="28"/>
-                                        <w:szCs w:val="28"/>
-                                        <w:lang w:val="fr-FR"/>
-                                      </w:rPr>
-                                      <w:t xml:space="preserve">- </w:t>
-                                    </w:r>
-                                    <w:r>
-                                      <w:rPr>
-                                        <w:rFonts w:ascii="Century Gothic" w:hAnsi="Century Gothic" w:cs="Times New Roman"/>
-                                        <w:caps/>
-                                        <w:color w:val="4472C4" w:themeColor="accent1"/>
-                                        <w:sz w:val="28"/>
-                                        <w:szCs w:val="28"/>
-                                        <w:lang w:val="fr-FR"/>
-                                      </w:rPr>
-                                      <w:t>13 MArs 2026</w:t>
+                                      <w:t>02 février 2026 13 MArs 2026</w:t>
                                     </w:r>
                                   </w:p>
                                 </w:sdtContent>
@@ -431,29 +409,7 @@
                                   <w:szCs w:val="28"/>
                                   <w:lang w:val="fr-FR"/>
                                 </w:rPr>
-                                <w:t xml:space="preserve">02 février 2026 </w:t>
-                              </w:r>
-                              <w:r>
-                                <w:rPr>
-                                  <w:rFonts w:ascii="Century Gothic" w:hAnsi="Century Gothic" w:cs="Times New Roman"/>
-                                  <w:caps/>
-                                  <w:color w:val="4472C4" w:themeColor="accent1"/>
-                                  <w:sz w:val="28"/>
-                                  <w:szCs w:val="28"/>
-                                  <w:lang w:val="fr-FR"/>
-                                </w:rPr>
-                                <w:t xml:space="preserve">- </w:t>
-                              </w:r>
-                              <w:r>
-                                <w:rPr>
-                                  <w:rFonts w:ascii="Century Gothic" w:hAnsi="Century Gothic" w:cs="Times New Roman"/>
-                                  <w:caps/>
-                                  <w:color w:val="4472C4" w:themeColor="accent1"/>
-                                  <w:sz w:val="28"/>
-                                  <w:szCs w:val="28"/>
-                                  <w:lang w:val="fr-FR"/>
-                                </w:rPr>
-                                <w:t>13 MArs 2026</w:t>
+                                <w:t>02 février 2026 13 MArs 2026</w:t>
                               </w:r>
                             </w:p>
                           </w:sdtContent>
@@ -910,67 +866,7 @@
               <w:noProof/>
             </w:rPr>
             <w:drawing>
-              <wp:anchor distT="0" distB="0" distL="114300" distR="114300" simplePos="0" relativeHeight="251658240" behindDoc="0" locked="0" layoutInCell="1" allowOverlap="1" wp14:anchorId="5C1EC61F" wp14:editId="7D44C16D">
-                <wp:simplePos x="0" y="0"/>
-                <wp:positionH relativeFrom="column">
-                  <wp:posOffset>4177030</wp:posOffset>
-                </wp:positionH>
-                <wp:positionV relativeFrom="paragraph">
-                  <wp:posOffset>253365</wp:posOffset>
-                </wp:positionV>
-                <wp:extent cx="762000" cy="762000"/>
-                <wp:effectExtent l="0" t="0" r="0" b="0"/>
-                <wp:wrapNone/>
-                <wp:docPr id="1972364966" name="Graphique 5" descr="Boîte à archives avec un remplissage uni"/>
-                <wp:cNvGraphicFramePr>
-                  <a:graphicFrameLocks xmlns:a="http://schemas.openxmlformats.org/drawingml/2006/main" noChangeAspect="1"/>
-                </wp:cNvGraphicFramePr>
-                <a:graphic xmlns:a="http://schemas.openxmlformats.org/drawingml/2006/main">
-                  <a:graphicData uri="http://schemas.openxmlformats.org/drawingml/2006/picture">
-                    <pic:pic xmlns:pic="http://schemas.openxmlformats.org/drawingml/2006/picture">
-                      <pic:nvPicPr>
-                        <pic:cNvPr id="1972364966" name="Graphique 1972364966" descr="Boîte à archives avec un remplissage uni"/>
-                        <pic:cNvPicPr/>
-                      </pic:nvPicPr>
-                      <pic:blipFill>
-                        <a:blip r:embed="rId15">
-                          <a:extLst>
-                            <a:ext uri="{96DAC541-7B7A-43D3-8B79-37D633B846F1}">
-                              <asvg:svgBlip xmlns:asvg="http://schemas.microsoft.com/office/drawing/2016/SVG/main" r:embed="rId16"/>
-                            </a:ext>
-                          </a:extLst>
-                        </a:blip>
-                        <a:stretch>
-                          <a:fillRect/>
-                        </a:stretch>
-                      </pic:blipFill>
-                      <pic:spPr>
-                        <a:xfrm>
-                          <a:off x="0" y="0"/>
-                          <a:ext cx="762000" cy="762000"/>
-                        </a:xfrm>
-                        <a:prstGeom prst="rect">
-                          <a:avLst/>
-                        </a:prstGeom>
-                      </pic:spPr>
-                    </pic:pic>
-                  </a:graphicData>
-                </a:graphic>
-                <wp14:sizeRelH relativeFrom="margin">
-                  <wp14:pctWidth>0</wp14:pctWidth>
-                </wp14:sizeRelH>
-                <wp14:sizeRelV relativeFrom="margin">
-                  <wp14:pctHeight>0</wp14:pctHeight>
-                </wp14:sizeRelV>
-              </wp:anchor>
-            </w:drawing>
-          </w:r>
-          <w:r>
-            <w:rPr>
-              <w:noProof/>
-            </w:rPr>
-            <w:drawing>
-              <wp:inline distT="0" distB="0" distL="0" distR="0" wp14:anchorId="628B61A4" wp14:editId="52AF9AA9">
+              <wp:inline distT="0" distB="0" distL="0" distR="0" wp14:anchorId="628B61A4" wp14:editId="4F970ED6">
                 <wp:extent cx="3267075" cy="3267075"/>
                 <wp:effectExtent l="0" t="0" r="0" b="0"/>
                 <wp:docPr id="752880632" name="Graphique 2" descr="Vivats avec un remplissage uni"/>
@@ -985,10 +881,10 @@
                         <pic:cNvPicPr/>
                       </pic:nvPicPr>
                       <pic:blipFill>
-                        <a:blip r:embed="rId17">
+                        <a:blip r:embed="rId15">
                           <a:extLst>
                             <a:ext uri="{96DAC541-7B7A-43D3-8B79-37D633B846F1}">
-                              <asvg:svgBlip xmlns:asvg="http://schemas.microsoft.com/office/drawing/2016/SVG/main" r:embed="rId18"/>
+                              <asvg:svgBlip xmlns:asvg="http://schemas.microsoft.com/office/drawing/2016/SVG/main" r:embed="rId16"/>
                             </a:ext>
                           </a:extLst>
                         </a:blip>
@@ -1024,8 +920,8 @@
         </w:p>
       </w:sdtContent>
     </w:sdt>
-    <w:bookmarkStart w:id="1" w:name="_Toc155696314" w:displacedByCustomXml="prev"/>
-    <w:bookmarkStart w:id="2" w:name="_Toc155697347" w:displacedByCustomXml="prev"/>
+    <w:bookmarkStart w:id="1" w:name="_Toc155697347" w:displacedByCustomXml="prev"/>
+    <w:bookmarkStart w:id="2" w:name="_Toc155696314" w:displacedByCustomXml="prev"/>
     <w:sdt>
       <w:sdtPr>
         <w:rPr>
@@ -3970,6 +3866,8 @@
           <w:pPr>
             <w:pStyle w:val="En-ttedetabledesmatires"/>
             <w:rPr>
+              <w:b/>
+              <w:bCs/>
               <w:lang w:val="fr-CH"/>
             </w:rPr>
           </w:pPr>
@@ -3979,34 +3877,7 @@
               <w:bCs/>
               <w:lang w:val="fr-CH"/>
             </w:rPr>
-            <w:lastRenderedPageBreak/>
             <w:fldChar w:fldCharType="end"/>
-          </w:r>
-          <w:r>
-            <w:rPr>
-              <w:lang w:val="fr-CH"/>
-            </w:rPr>
-            <w:t xml:space="preserve"> </w:t>
-          </w:r>
-        </w:p>
-        <w:p>
-          <w:pPr>
-            <w:pStyle w:val="En-ttedetabledesmatires"/>
-            <w:rPr>
-              <w:lang w:val="fr-CH"/>
-            </w:rPr>
-          </w:pPr>
-          <w:r>
-            <w:rPr>
-              <w:lang w:val="fr-CH"/>
-            </w:rPr>
-            <w:t>Table des</w:t>
-          </w:r>
-          <w:r>
-            <w:rPr>
-              <w:lang w:val="fr-CH"/>
-            </w:rPr>
-            <w:t xml:space="preserve"> illustrations</w:t>
           </w:r>
         </w:p>
       </w:sdtContent>
@@ -4018,12 +3889,44 @@
           <w:lang w:eastAsia="en-GB"/>
         </w:rPr>
       </w:pPr>
-      <w:bookmarkStart w:id="3" w:name="_Toc25553331"/>
-      <w:bookmarkStart w:id="4" w:name="_Toc71703267"/>
-      <w:bookmarkStart w:id="5" w:name="_Toc499021852"/>
-      <w:bookmarkStart w:id="6" w:name="_Toc224557403"/>
+      <w:bookmarkStart w:id="3" w:name="_Toc224557403"/>
+      <w:bookmarkStart w:id="4" w:name="_Toc25553331"/>
+      <w:bookmarkStart w:id="5" w:name="_Toc71703267"/>
+      <w:bookmarkStart w:id="6" w:name="_Toc499021852"/>
       <w:bookmarkEnd w:id="2"/>
       <w:bookmarkEnd w:id="1"/>
+    </w:p>
+    <w:p>
+      <w:pPr>
+        <w:pStyle w:val="Titre1"/>
+        <w:rPr>
+          <w:noProof/>
+          <w:lang w:eastAsia="en-GB"/>
+        </w:rPr>
+      </w:pPr>
+      <w:r>
+        <w:lastRenderedPageBreak/>
+        <w:t>Table des</w:t>
+      </w:r>
+      <w:r>
+        <w:t xml:space="preserve"> illustrations</w:t>
+      </w:r>
+      <w:r>
+        <w:rPr>
+          <w:noProof/>
+          <w:lang w:eastAsia="en-GB"/>
+        </w:rPr>
+        <w:t xml:space="preserve"> </w:t>
+      </w:r>
+    </w:p>
+    <w:p>
+      <w:pPr>
+        <w:pStyle w:val="Titre1"/>
+        <w:rPr>
+          <w:noProof/>
+          <w:lang w:eastAsia="en-GB"/>
+        </w:rPr>
+      </w:pPr>
       <w:r>
         <w:rPr>
           <w:noProof/>
@@ -4489,7 +4392,7 @@
         <w:lastRenderedPageBreak/>
         <w:t>Rappor tde gestion et de réalisation</w:t>
       </w:r>
-      <w:bookmarkEnd w:id="6"/>
+      <w:bookmarkEnd w:id="3"/>
     </w:p>
     <w:p>
       <w:pPr>
@@ -4506,11 +4409,6 @@
       <w:bookmarkEnd w:id="7"/>
     </w:p>
     <w:p>
-      <w:r>
-        <w:t xml:space="preserve">  </w:t>
-      </w:r>
-    </w:p>
-    <w:p>
       <w:pPr>
         <w:pStyle w:val="Titre2"/>
         <w:numPr>
@@ -4520,7 +4418,6 @@
       </w:pPr>
       <w:bookmarkStart w:id="8" w:name="_Toc224557405"/>
       <w:r>
-        <w:lastRenderedPageBreak/>
         <w:t>Méthode et organisation</w:t>
       </w:r>
       <w:bookmarkEnd w:id="8"/>
@@ -4892,9 +4789,9 @@
       <w:r>
         <w:t>Manuel d'Installation</w:t>
       </w:r>
-      <w:bookmarkEnd w:id="3"/>
       <w:bookmarkEnd w:id="4"/>
       <w:bookmarkEnd w:id="5"/>
+      <w:bookmarkEnd w:id="6"/>
       <w:bookmarkEnd w:id="32"/>
     </w:p>
     <w:p>
@@ -4933,20 +4830,20 @@
       </w:pPr>
       <w:bookmarkStart w:id="37" w:name="_Toc71703270"/>
       <w:bookmarkStart w:id="38" w:name="_Toc499021854"/>
-      <w:bookmarkStart w:id="39" w:name="_Toc25553334"/>
-      <w:bookmarkStart w:id="40" w:name="_Hlk224302782"/>
-      <w:bookmarkStart w:id="41" w:name="_Toc224557431"/>
+      <w:bookmarkStart w:id="39" w:name="_Toc224557431"/>
+      <w:bookmarkStart w:id="40" w:name="_Toc25553334"/>
+      <w:bookmarkStart w:id="41" w:name="_Hlk224302782"/>
       <w:r>
         <w:t>Archives du projet</w:t>
       </w:r>
       <w:bookmarkEnd w:id="37"/>
       <w:bookmarkEnd w:id="38"/>
-      <w:bookmarkEnd w:id="41"/>
+      <w:bookmarkEnd w:id="39"/>
       <w:r>
         <w:t xml:space="preserve"> </w:t>
       </w:r>
-      <w:bookmarkEnd w:id="39"/>
       <w:bookmarkEnd w:id="40"/>
+      <w:bookmarkEnd w:id="41"/>
     </w:p>
     <w:p>
       <w:pPr>
@@ -4959,14 +4856,14 @@
           <w:i/>
         </w:rPr>
       </w:pPr>
-      <w:bookmarkStart w:id="42" w:name="_Toc25553330"/>
-      <w:bookmarkStart w:id="43" w:name="_Toc71703266"/>
-      <w:bookmarkStart w:id="44" w:name="_Toc499021851"/>
-      <w:bookmarkStart w:id="45" w:name="_Toc224557432"/>
+      <w:bookmarkStart w:id="42" w:name="_Toc224557432"/>
+      <w:bookmarkStart w:id="43" w:name="_Toc25553330"/>
+      <w:bookmarkStart w:id="44" w:name="_Toc71703266"/>
+      <w:bookmarkStart w:id="45" w:name="_Toc499021851"/>
       <w:r>
         <w:t>Sources – Bibliographie</w:t>
       </w:r>
-      <w:bookmarkEnd w:id="45"/>
+      <w:bookmarkEnd w:id="42"/>
     </w:p>
     <w:p>
       <w:pPr>
@@ -4980,17 +4877,17 @@
       <w:r>
         <w:t>Journal de travail</w:t>
       </w:r>
-      <w:bookmarkEnd w:id="42"/>
       <w:bookmarkEnd w:id="43"/>
       <w:bookmarkEnd w:id="44"/>
+      <w:bookmarkEnd w:id="45"/>
       <w:bookmarkEnd w:id="46"/>
     </w:p>
     <w:p/>
     <w:sectPr>
-      <w:headerReference w:type="default" r:id="rId19"/>
-      <w:footerReference w:type="default" r:id="rId20"/>
-      <w:headerReference w:type="first" r:id="rId21"/>
-      <w:footerReference w:type="first" r:id="rId22"/>
+      <w:headerReference w:type="default" r:id="rId17"/>
+      <w:footerReference w:type="default" r:id="rId18"/>
+      <w:headerReference w:type="first" r:id="rId19"/>
+      <w:footerReference w:type="first" r:id="rId20"/>
       <w:pgSz w:w="11906" w:h="16838"/>
       <w:pgMar w:top="1417" w:right="1417" w:bottom="1417" w:left="1417" w:header="708" w:footer="708" w:gutter="0"/>
       <w:cols w:space="708"/>
@@ -5094,7 +4991,7 @@
             </wp:anchor>
           </w:drawing>
         </mc:Choice>
-        <mc:Fallback xmlns:w16du="http://schemas.microsoft.com/office/word/2023/wordml/word16du" xmlns:w16sdtfl="http://schemas.microsoft.com/office/word/2024/wordml/sdtformatlock" xmlns:arto="http://schemas.microsoft.com/office/word/2006/arto" xmlns:a="http://schemas.openxmlformats.org/drawingml/2006/main">
+        <mc:Fallback xmlns:a="http://schemas.openxmlformats.org/drawingml/2006/main" xmlns:arto="http://schemas.microsoft.com/office/word/2006/arto" xmlns:w16sdtfl="http://schemas.microsoft.com/office/word/2024/wordml/sdtformatlock" xmlns:w16du="http://schemas.microsoft.com/office/word/2023/wordml/word16du">
           <w:pict w14:anchorId="2AC6186A">
             <v:line id="Conector recto 2" style="position:absolute;z-index:251659264;visibility:visible;mso-wrap-style:square;mso-width-percent:0;mso-wrap-distance-left:9pt;mso-wrap-distance-top:0;mso-wrap-distance-right:9pt;mso-wrap-distance-bottom:0;mso-position-horizontal:left;mso-position-horizontal-relative:margin;mso-position-vertical:absolute;mso-position-vertical-relative:text;mso-width-percent:0;mso-width-relative:margin" o:spid="_x0000_s1026" strokecolor="#4472c4 [3204]" strokeweight=".5pt" from="0,20.1pt" to="452.9pt,20.1pt" w14:anchorId="378E8825" o:gfxdata="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">
               <v:stroke joinstyle="miter"/>
@@ -5359,23 +5256,13 @@
       </w:rPr>
       <w:t xml:space="preserve"> </w:t>
     </w:r>
-    <w:proofErr w:type="spellStart"/>
     <w:r>
       <w:rPr>
         <w:rFonts w:cs="Times New Roman"/>
         <w:color w:val="4472C4" w:themeColor="accent1"/>
         <w:lang w:val="en-US"/>
       </w:rPr>
-      <w:t>ZweiteVie</w:t>
-    </w:r>
-    <w:proofErr w:type="spellEnd"/>
-    <w:r>
-      <w:rPr>
-        <w:rFonts w:cs="Times New Roman"/>
-        <w:color w:val="4472C4" w:themeColor="accent1"/>
-        <w:lang w:val="en-US"/>
-      </w:rPr>
-      <w:t xml:space="preserve"> A</w:t>
+      <w:t>ZweiteVie A</w:t>
     </w:r>
     <w:r>
       <w:rPr>
@@ -14221,6 +14108,7 @@
     <w:rsid w:val="0042049E"/>
     <w:rsid w:val="004D6A39"/>
     <w:rsid w:val="00590BCE"/>
+    <w:rsid w:val="005A6A0F"/>
     <w:rsid w:val="005D0FBE"/>
     <w:rsid w:val="005D2E87"/>
     <w:rsid w:val="006108C4"/>
@@ -14257,6 +14145,7 @@
     <w:rsid w:val="00D92717"/>
     <w:rsid w:val="00E07D08"/>
     <w:rsid w:val="00E124E3"/>
+    <w:rsid w:val="00E346C9"/>
     <w:rsid w:val="00E72BAA"/>
     <w:rsid w:val="00E83A19"/>
     <w:rsid w:val="00EB6A2D"/>
@@ -15042,12 +14931,7 @@
 </file>
 
 <file path=customXml/item3.xml><?xml version="1.0" encoding="utf-8"?>
-<?mso-contentType ?>
-<FormTemplates xmlns="http://schemas.microsoft.com/sharepoint/v3/contenttype/forms">
-  <Display>DocumentLibraryForm</Display>
-  <Edit>DocumentLibraryForm</Edit>
-  <New>DocumentLibraryForm</New>
-</FormTemplates>
+<b:Sources xmlns:b="http://schemas.openxmlformats.org/officeDocument/2006/bibliography" xmlns="http://schemas.openxmlformats.org/officeDocument/2006/bibliography" SelectedStyle="\APASixthEditionOfficeOnline.xsl" StyleName="APA" Version="6"/>
 </file>
 
 <file path=customXml/item4.xml><?xml version="1.0" encoding="utf-8"?>
@@ -15268,7 +15152,12 @@
 </file>
 
 <file path=customXml/item5.xml><?xml version="1.0" encoding="utf-8"?>
-<b:Sources xmlns:b="http://schemas.openxmlformats.org/officeDocument/2006/bibliography" xmlns="http://schemas.openxmlformats.org/officeDocument/2006/bibliography" SelectedStyle="\APASixthEditionOfficeOnline.xsl" StyleName="APA" Version="6"/>
+<?mso-contentType ?>
+<FormTemplates xmlns="http://schemas.microsoft.com/sharepoint/v3/contenttype/forms">
+  <Display>DocumentLibraryForm</Display>
+  <Edit>DocumentLibraryForm</Edit>
+  <New>DocumentLibraryForm</New>
+</FormTemplates>
 </file>
 
 <file path=customXml/itemProps1.xml><?xml version="1.0" encoding="utf-8"?>
@@ -15291,9 +15180,9 @@
 </file>
 
 <file path=customXml/itemProps3.xml><?xml version="1.0" encoding="utf-8"?>
-<ds:datastoreItem xmlns:ds="http://schemas.openxmlformats.org/officeDocument/2006/customXml" ds:itemID="{49F5DEE4-C8F3-42DE-BB91-D4B66B0C8CBB}">
+<ds:datastoreItem xmlns:ds="http://schemas.openxmlformats.org/officeDocument/2006/customXml" ds:itemID="{FE924DA7-0126-48C5-870A-49921258AF89}">
   <ds:schemaRefs>
-    <ds:schemaRef ds:uri="http://schemas.microsoft.com/sharepoint/v3/contenttype/forms"/>
+    <ds:schemaRef ds:uri="http://schemas.openxmlformats.org/officeDocument/2006/bibliography"/>
   </ds:schemaRefs>
 </ds:datastoreItem>
 </file>
@@ -15318,9 +15207,9 @@
 </file>
 
 <file path=customXml/itemProps5.xml><?xml version="1.0" encoding="utf-8"?>
-<ds:datastoreItem xmlns:ds="http://schemas.openxmlformats.org/officeDocument/2006/customXml" ds:itemID="{FE924DA7-0126-48C5-870A-49921258AF89}">
+<ds:datastoreItem xmlns:ds="http://schemas.openxmlformats.org/officeDocument/2006/customXml" ds:itemID="{49F5DEE4-C8F3-42DE-BB91-D4B66B0C8CBB}">
   <ds:schemaRefs>
-    <ds:schemaRef ds:uri="http://schemas.openxmlformats.org/officeDocument/2006/bibliography"/>
+    <ds:schemaRef ds:uri="http://schemas.microsoft.com/sharepoint/v3/contenttype/forms"/>
   </ds:schemaRefs>
 </ds:datastoreItem>
 </file>
</xml_diff>